<commit_message>
Expand coursework database schema to 10 tables, add CRUD templates, and update documentation report generator
</commit_message>
<xml_diff>
--- a/Курсовая_работа_ТехноПромСборка.docx
+++ b/Курсовая_работа_ТехноПромСборка.docx
@@ -758,15 +758,25 @@
       <w:r>
         <w:t>В результате анализа предметной области были выделены следующие сущности:</w:t>
         <w:br/>
-        <w:t>• Деталь (КодДетали, Название, Артикул);</w:t>
+        <w:t>• Категория деталей (КодКатегории, Название);</w:t>
+        <w:br/>
+        <w:t>• Деталь (КодДетали, Название, Артикул, КодКатегории);</w:t>
+        <w:br/>
+        <w:t>• Поставщик (КодПоставщика, Название, КонтактнаяИнформация);</w:t>
+        <w:br/>
+        <w:t>• Поставка деталей (КодПоставки, КодПоставщика, КодДетали, Количество, Цена, ДатаПоставки);</w:t>
         <w:br/>
         <w:t>• Изделие (КодИзделия, Название, Описание);</w:t>
+        <w:br/>
+        <w:t>• Состав изделия / Спецификация (КодИзделия, КодДетали, Количество);</w:t>
         <w:br/>
         <w:t>• Ячейка склада деталей (КодЯчейкиДеталей, НомерЯчейки, КодДетали, Количество);</w:t>
         <w:br/>
         <w:t>• Ячейка склада изделий (КодЯчейкиИзделий, НомерЯчейки, КодИзделия, Количество);</w:t>
         <w:br/>
-        <w:t>• План производства (КодИзделия, ПланируемоеКоличество).</w:t>
+        <w:t>• План производства (КодИзделия, ПланируемоеКоличество);</w:t>
+        <w:br/>
+        <w:t>• Заказ клиента (КодЗаказа, ИмяКлиента, КодИзделия, Количество, ДатаЗаказа, Статус).</w:t>
       </w:r>
     </w:p>
     <w:p>
@@ -786,6 +796,12 @@
     </w:p>
     <w:p>
       <w:r>
+        <w:t>• Категория — Деталь: Каждая деталь относится к одной категории. В категории может быть множество деталей.</w:t>
+        <w:br/>
+        <w:t>• Поставщик — Поставка: Поставщик может совершать множество поставок. Поставка совершается одним поставщиком.</w:t>
+        <w:br/>
+        <w:t>• Деталь — Поставка: Деталь может поставляться многократно.</w:t>
+        <w:br/>
         <w:t>• Изделие — Состав: Изделие может состоять из многих деталей. Деталь может входить в состав многих изделий.</w:t>
         <w:br/>
         <w:t>• Деталь — Ячейка склада: Деталь может быть размещена в нескольких ячейках. В ячейке может находиться только одна деталь.</w:t>
@@ -793,6 +809,8 @@
         <w:t>• Изделие — Ячейка готовой продукции: Изделие может находиться в нескольких ячейках готовой продукции. В ячейке хранится только одно изделие.</w:t>
         <w:br/>
         <w:t>• Изделие — План: Каждое изделие имеет один целевой показатель плана.</w:t>
+        <w:br/>
+        <w:t>• Изделие — Заказ: Заказ оформляется на конкретное изделие. Изделие может заказываться в различных заказах.</w:t>
       </w:r>
     </w:p>
     <w:p>
@@ -870,7 +888,13 @@
       <w:r>
         <w:t>Логическая схема базы данных представлена в виде следующих отношений (таблиц):</w:t>
         <w:br/>
-        <w:t>• part(id_part, name, article);</w:t>
+        <w:t>• part_category(id_category, name);</w:t>
+        <w:br/>
+        <w:t>• part(id_part, name, article, category_id);</w:t>
+        <w:br/>
+        <w:t>• supplier(id_supplier, name, contact_info);</w:t>
+        <w:br/>
+        <w:t>• part_supply(id_supply, supplier_id, part_id, quantity, price, supply_date);</w:t>
         <w:br/>
         <w:t>• product_type(id_product_type, name, description);</w:t>
         <w:br/>
@@ -880,7 +904,9 @@
         <w:br/>
         <w:t>• product_warehouse_cell(id_product_cell, cell_number, product_type_id, quantity_stored);</w:t>
         <w:br/>
-        <w:t>• production_plan(product_type_id, target_quantity).</w:t>
+        <w:t>• production_plan(product_type_id, target_quantity);</w:t>
+        <w:br/>
+        <w:t>• client_order(id_order, customer_name, product_type_id, quantity, order_date, status).</w:t>
       </w:r>
     </w:p>
     <w:p>
@@ -1000,6 +1026,177 @@
                 <w:sz w:val="22"/>
               </w:rPr>
               <w:t>Ключ</w:t>
+            </w:r>
+          </w:p>
+        </w:tc>
+      </w:tr>
+      <w:tr>
+        <w:tc>
+          <w:tcPr>
+            <w:tcW w:type="dxa" w:w="1663"/>
+          </w:tcPr>
+          <w:p>
+            <w:r>
+              <w:rPr>
+                <w:rFonts w:ascii="Times New Roman" w:hAnsi="Times New Roman"/>
+                <w:sz w:val="20"/>
+              </w:rPr>
+              <w:t>Part_Category</w:t>
+            </w:r>
+          </w:p>
+        </w:tc>
+        <w:tc>
+          <w:tcPr>
+            <w:tcW w:type="dxa" w:w="1663"/>
+          </w:tcPr>
+          <w:p>
+            <w:r>
+              <w:rPr>
+                <w:rFonts w:ascii="Times New Roman" w:hAnsi="Times New Roman"/>
+                <w:sz w:val="20"/>
+              </w:rPr>
+              <w:t>КодКатегории</w:t>
+            </w:r>
+          </w:p>
+        </w:tc>
+        <w:tc>
+          <w:tcPr>
+            <w:tcW w:type="dxa" w:w="1663"/>
+          </w:tcPr>
+          <w:p>
+            <w:r>
+              <w:rPr>
+                <w:rFonts w:ascii="Times New Roman" w:hAnsi="Times New Roman"/>
+                <w:sz w:val="20"/>
+              </w:rPr>
+              <w:t>id_category</w:t>
+            </w:r>
+          </w:p>
+        </w:tc>
+        <w:tc>
+          <w:tcPr>
+            <w:tcW w:type="dxa" w:w="1663"/>
+          </w:tcPr>
+          <w:p>
+            <w:r>
+              <w:rPr>
+                <w:rFonts w:ascii="Times New Roman" w:hAnsi="Times New Roman"/>
+                <w:sz w:val="20"/>
+              </w:rPr>
+              <w:t>I</w:t>
+            </w:r>
+          </w:p>
+        </w:tc>
+        <w:tc>
+          <w:tcPr>
+            <w:tcW w:type="dxa" w:w="1663"/>
+          </w:tcPr>
+          <w:p>
+            <w:r>
+              <w:rPr>
+                <w:rFonts w:ascii="Times New Roman" w:hAnsi="Times New Roman"/>
+                <w:sz w:val="20"/>
+              </w:rPr>
+              <w:t>20</w:t>
+            </w:r>
+          </w:p>
+        </w:tc>
+        <w:tc>
+          <w:tcPr>
+            <w:tcW w:type="dxa" w:w="1663"/>
+          </w:tcPr>
+          <w:p>
+            <w:r>
+              <w:rPr>
+                <w:rFonts w:ascii="Times New Roman" w:hAnsi="Times New Roman"/>
+                <w:sz w:val="20"/>
+              </w:rPr>
+              <w:t>*</w:t>
+            </w:r>
+          </w:p>
+        </w:tc>
+      </w:tr>
+      <w:tr>
+        <w:tc>
+          <w:tcPr>
+            <w:tcW w:type="dxa" w:w="1663"/>
+          </w:tcPr>
+          <w:p>
+            <w:r>
+              <w:rPr>
+                <w:rFonts w:ascii="Times New Roman" w:hAnsi="Times New Roman"/>
+                <w:sz w:val="20"/>
+              </w:rPr>
+              <w:t>Part_Category</w:t>
+            </w:r>
+          </w:p>
+        </w:tc>
+        <w:tc>
+          <w:tcPr>
+            <w:tcW w:type="dxa" w:w="1663"/>
+          </w:tcPr>
+          <w:p>
+            <w:r>
+              <w:rPr>
+                <w:rFonts w:ascii="Times New Roman" w:hAnsi="Times New Roman"/>
+                <w:sz w:val="20"/>
+              </w:rPr>
+              <w:t>Название категории</w:t>
+            </w:r>
+          </w:p>
+        </w:tc>
+        <w:tc>
+          <w:tcPr>
+            <w:tcW w:type="dxa" w:w="1663"/>
+          </w:tcPr>
+          <w:p>
+            <w:r>
+              <w:rPr>
+                <w:rFonts w:ascii="Times New Roman" w:hAnsi="Times New Roman"/>
+                <w:sz w:val="20"/>
+              </w:rPr>
+              <w:t>name</w:t>
+            </w:r>
+          </w:p>
+        </w:tc>
+        <w:tc>
+          <w:tcPr>
+            <w:tcW w:type="dxa" w:w="1663"/>
+          </w:tcPr>
+          <w:p>
+            <w:r>
+              <w:rPr>
+                <w:rFonts w:ascii="Times New Roman" w:hAnsi="Times New Roman"/>
+                <w:sz w:val="20"/>
+              </w:rPr>
+              <w:t>S</w:t>
+            </w:r>
+          </w:p>
+        </w:tc>
+        <w:tc>
+          <w:tcPr>
+            <w:tcW w:type="dxa" w:w="1663"/>
+          </w:tcPr>
+          <w:p>
+            <w:r>
+              <w:rPr>
+                <w:rFonts w:ascii="Times New Roman" w:hAnsi="Times New Roman"/>
+                <w:sz w:val="20"/>
+              </w:rPr>
+              <w:t>255</w:t>
+            </w:r>
+          </w:p>
+        </w:tc>
+        <w:tc>
+          <w:tcPr>
+            <w:tcW w:type="dxa" w:w="1663"/>
+          </w:tcPr>
+          <w:p>
+            <w:r>
+              <w:rPr>
+                <w:rFonts w:ascii="Times New Roman" w:hAnsi="Times New Roman"/>
+                <w:sz w:val="20"/>
+              </w:rPr>
             </w:r>
           </w:p>
         </w:tc>
@@ -1271,6 +1468,858 @@
                 <w:rFonts w:ascii="Times New Roman" w:hAnsi="Times New Roman"/>
                 <w:sz w:val="20"/>
               </w:rPr>
+              <w:t>Part</w:t>
+            </w:r>
+          </w:p>
+        </w:tc>
+        <w:tc>
+          <w:tcPr>
+            <w:tcW w:type="dxa" w:w="1663"/>
+          </w:tcPr>
+          <w:p>
+            <w:r>
+              <w:rPr>
+                <w:rFonts w:ascii="Times New Roman" w:hAnsi="Times New Roman"/>
+                <w:sz w:val="20"/>
+              </w:rPr>
+              <w:t>КодКатегории</w:t>
+            </w:r>
+          </w:p>
+        </w:tc>
+        <w:tc>
+          <w:tcPr>
+            <w:tcW w:type="dxa" w:w="1663"/>
+          </w:tcPr>
+          <w:p>
+            <w:r>
+              <w:rPr>
+                <w:rFonts w:ascii="Times New Roman" w:hAnsi="Times New Roman"/>
+                <w:sz w:val="20"/>
+              </w:rPr>
+              <w:t>category_id</w:t>
+            </w:r>
+          </w:p>
+        </w:tc>
+        <w:tc>
+          <w:tcPr>
+            <w:tcW w:type="dxa" w:w="1663"/>
+          </w:tcPr>
+          <w:p>
+            <w:r>
+              <w:rPr>
+                <w:rFonts w:ascii="Times New Roman" w:hAnsi="Times New Roman"/>
+                <w:sz w:val="20"/>
+              </w:rPr>
+              <w:t>I</w:t>
+            </w:r>
+          </w:p>
+        </w:tc>
+        <w:tc>
+          <w:tcPr>
+            <w:tcW w:type="dxa" w:w="1663"/>
+          </w:tcPr>
+          <w:p>
+            <w:r>
+              <w:rPr>
+                <w:rFonts w:ascii="Times New Roman" w:hAnsi="Times New Roman"/>
+                <w:sz w:val="20"/>
+              </w:rPr>
+              <w:t>20</w:t>
+            </w:r>
+          </w:p>
+        </w:tc>
+        <w:tc>
+          <w:tcPr>
+            <w:tcW w:type="dxa" w:w="1663"/>
+          </w:tcPr>
+          <w:p>
+            <w:r>
+              <w:rPr>
+                <w:rFonts w:ascii="Times New Roman" w:hAnsi="Times New Roman"/>
+                <w:sz w:val="20"/>
+              </w:rPr>
+            </w:r>
+          </w:p>
+        </w:tc>
+      </w:tr>
+      <w:tr>
+        <w:tc>
+          <w:tcPr>
+            <w:tcW w:type="dxa" w:w="1663"/>
+          </w:tcPr>
+          <w:p>
+            <w:r>
+              <w:rPr>
+                <w:rFonts w:ascii="Times New Roman" w:hAnsi="Times New Roman"/>
+                <w:sz w:val="20"/>
+              </w:rPr>
+              <w:t>Supplier</w:t>
+            </w:r>
+          </w:p>
+        </w:tc>
+        <w:tc>
+          <w:tcPr>
+            <w:tcW w:type="dxa" w:w="1663"/>
+          </w:tcPr>
+          <w:p>
+            <w:r>
+              <w:rPr>
+                <w:rFonts w:ascii="Times New Roman" w:hAnsi="Times New Roman"/>
+                <w:sz w:val="20"/>
+              </w:rPr>
+              <w:t>КодПоставщика</w:t>
+            </w:r>
+          </w:p>
+        </w:tc>
+        <w:tc>
+          <w:tcPr>
+            <w:tcW w:type="dxa" w:w="1663"/>
+          </w:tcPr>
+          <w:p>
+            <w:r>
+              <w:rPr>
+                <w:rFonts w:ascii="Times New Roman" w:hAnsi="Times New Roman"/>
+                <w:sz w:val="20"/>
+              </w:rPr>
+              <w:t>id_supplier</w:t>
+            </w:r>
+          </w:p>
+        </w:tc>
+        <w:tc>
+          <w:tcPr>
+            <w:tcW w:type="dxa" w:w="1663"/>
+          </w:tcPr>
+          <w:p>
+            <w:r>
+              <w:rPr>
+                <w:rFonts w:ascii="Times New Roman" w:hAnsi="Times New Roman"/>
+                <w:sz w:val="20"/>
+              </w:rPr>
+              <w:t>I</w:t>
+            </w:r>
+          </w:p>
+        </w:tc>
+        <w:tc>
+          <w:tcPr>
+            <w:tcW w:type="dxa" w:w="1663"/>
+          </w:tcPr>
+          <w:p>
+            <w:r>
+              <w:rPr>
+                <w:rFonts w:ascii="Times New Roman" w:hAnsi="Times New Roman"/>
+                <w:sz w:val="20"/>
+              </w:rPr>
+              <w:t>20</w:t>
+            </w:r>
+          </w:p>
+        </w:tc>
+        <w:tc>
+          <w:tcPr>
+            <w:tcW w:type="dxa" w:w="1663"/>
+          </w:tcPr>
+          <w:p>
+            <w:r>
+              <w:rPr>
+                <w:rFonts w:ascii="Times New Roman" w:hAnsi="Times New Roman"/>
+                <w:sz w:val="20"/>
+              </w:rPr>
+              <w:t>*</w:t>
+            </w:r>
+          </w:p>
+        </w:tc>
+      </w:tr>
+      <w:tr>
+        <w:tc>
+          <w:tcPr>
+            <w:tcW w:type="dxa" w:w="1663"/>
+          </w:tcPr>
+          <w:p>
+            <w:r>
+              <w:rPr>
+                <w:rFonts w:ascii="Times New Roman" w:hAnsi="Times New Roman"/>
+                <w:sz w:val="20"/>
+              </w:rPr>
+              <w:t>Supplier</w:t>
+            </w:r>
+          </w:p>
+        </w:tc>
+        <w:tc>
+          <w:tcPr>
+            <w:tcW w:type="dxa" w:w="1663"/>
+          </w:tcPr>
+          <w:p>
+            <w:r>
+              <w:rPr>
+                <w:rFonts w:ascii="Times New Roman" w:hAnsi="Times New Roman"/>
+                <w:sz w:val="20"/>
+              </w:rPr>
+              <w:t>Название поставщика</w:t>
+            </w:r>
+          </w:p>
+        </w:tc>
+        <w:tc>
+          <w:tcPr>
+            <w:tcW w:type="dxa" w:w="1663"/>
+          </w:tcPr>
+          <w:p>
+            <w:r>
+              <w:rPr>
+                <w:rFonts w:ascii="Times New Roman" w:hAnsi="Times New Roman"/>
+                <w:sz w:val="20"/>
+              </w:rPr>
+              <w:t>name</w:t>
+            </w:r>
+          </w:p>
+        </w:tc>
+        <w:tc>
+          <w:tcPr>
+            <w:tcW w:type="dxa" w:w="1663"/>
+          </w:tcPr>
+          <w:p>
+            <w:r>
+              <w:rPr>
+                <w:rFonts w:ascii="Times New Roman" w:hAnsi="Times New Roman"/>
+                <w:sz w:val="20"/>
+              </w:rPr>
+              <w:t>S</w:t>
+            </w:r>
+          </w:p>
+        </w:tc>
+        <w:tc>
+          <w:tcPr>
+            <w:tcW w:type="dxa" w:w="1663"/>
+          </w:tcPr>
+          <w:p>
+            <w:r>
+              <w:rPr>
+                <w:rFonts w:ascii="Times New Roman" w:hAnsi="Times New Roman"/>
+                <w:sz w:val="20"/>
+              </w:rPr>
+              <w:t>255</w:t>
+            </w:r>
+          </w:p>
+        </w:tc>
+        <w:tc>
+          <w:tcPr>
+            <w:tcW w:type="dxa" w:w="1663"/>
+          </w:tcPr>
+          <w:p>
+            <w:r>
+              <w:rPr>
+                <w:rFonts w:ascii="Times New Roman" w:hAnsi="Times New Roman"/>
+                <w:sz w:val="20"/>
+              </w:rPr>
+            </w:r>
+          </w:p>
+        </w:tc>
+      </w:tr>
+      <w:tr>
+        <w:tc>
+          <w:tcPr>
+            <w:tcW w:type="dxa" w:w="1663"/>
+          </w:tcPr>
+          <w:p>
+            <w:r>
+              <w:rPr>
+                <w:rFonts w:ascii="Times New Roman" w:hAnsi="Times New Roman"/>
+                <w:sz w:val="20"/>
+              </w:rPr>
+              <w:t>Supplier</w:t>
+            </w:r>
+          </w:p>
+        </w:tc>
+        <w:tc>
+          <w:tcPr>
+            <w:tcW w:type="dxa" w:w="1663"/>
+          </w:tcPr>
+          <w:p>
+            <w:r>
+              <w:rPr>
+                <w:rFonts w:ascii="Times New Roman" w:hAnsi="Times New Roman"/>
+                <w:sz w:val="20"/>
+              </w:rPr>
+              <w:t>Контакты</w:t>
+            </w:r>
+          </w:p>
+        </w:tc>
+        <w:tc>
+          <w:tcPr>
+            <w:tcW w:type="dxa" w:w="1663"/>
+          </w:tcPr>
+          <w:p>
+            <w:r>
+              <w:rPr>
+                <w:rFonts w:ascii="Times New Roman" w:hAnsi="Times New Roman"/>
+                <w:sz w:val="20"/>
+              </w:rPr>
+              <w:t>contact_info</w:t>
+            </w:r>
+          </w:p>
+        </w:tc>
+        <w:tc>
+          <w:tcPr>
+            <w:tcW w:type="dxa" w:w="1663"/>
+          </w:tcPr>
+          <w:p>
+            <w:r>
+              <w:rPr>
+                <w:rFonts w:ascii="Times New Roman" w:hAnsi="Times New Roman"/>
+                <w:sz w:val="20"/>
+              </w:rPr>
+              <w:t>S</w:t>
+            </w:r>
+          </w:p>
+        </w:tc>
+        <w:tc>
+          <w:tcPr>
+            <w:tcW w:type="dxa" w:w="1663"/>
+          </w:tcPr>
+          <w:p>
+            <w:r>
+              <w:rPr>
+                <w:rFonts w:ascii="Times New Roman" w:hAnsi="Times New Roman"/>
+                <w:sz w:val="20"/>
+              </w:rPr>
+              <w:t>255</w:t>
+            </w:r>
+          </w:p>
+        </w:tc>
+        <w:tc>
+          <w:tcPr>
+            <w:tcW w:type="dxa" w:w="1663"/>
+          </w:tcPr>
+          <w:p>
+            <w:r>
+              <w:rPr>
+                <w:rFonts w:ascii="Times New Roman" w:hAnsi="Times New Roman"/>
+                <w:sz w:val="20"/>
+              </w:rPr>
+            </w:r>
+          </w:p>
+        </w:tc>
+      </w:tr>
+      <w:tr>
+        <w:tc>
+          <w:tcPr>
+            <w:tcW w:type="dxa" w:w="1663"/>
+          </w:tcPr>
+          <w:p>
+            <w:r>
+              <w:rPr>
+                <w:rFonts w:ascii="Times New Roman" w:hAnsi="Times New Roman"/>
+                <w:sz w:val="20"/>
+              </w:rPr>
+              <w:t>Part_Supply</w:t>
+            </w:r>
+          </w:p>
+        </w:tc>
+        <w:tc>
+          <w:tcPr>
+            <w:tcW w:type="dxa" w:w="1663"/>
+          </w:tcPr>
+          <w:p>
+            <w:r>
+              <w:rPr>
+                <w:rFonts w:ascii="Times New Roman" w:hAnsi="Times New Roman"/>
+                <w:sz w:val="20"/>
+              </w:rPr>
+              <w:t>КодПоставки</w:t>
+            </w:r>
+          </w:p>
+        </w:tc>
+        <w:tc>
+          <w:tcPr>
+            <w:tcW w:type="dxa" w:w="1663"/>
+          </w:tcPr>
+          <w:p>
+            <w:r>
+              <w:rPr>
+                <w:rFonts w:ascii="Times New Roman" w:hAnsi="Times New Roman"/>
+                <w:sz w:val="20"/>
+              </w:rPr>
+              <w:t>id_supply</w:t>
+            </w:r>
+          </w:p>
+        </w:tc>
+        <w:tc>
+          <w:tcPr>
+            <w:tcW w:type="dxa" w:w="1663"/>
+          </w:tcPr>
+          <w:p>
+            <w:r>
+              <w:rPr>
+                <w:rFonts w:ascii="Times New Roman" w:hAnsi="Times New Roman"/>
+                <w:sz w:val="20"/>
+              </w:rPr>
+              <w:t>I</w:t>
+            </w:r>
+          </w:p>
+        </w:tc>
+        <w:tc>
+          <w:tcPr>
+            <w:tcW w:type="dxa" w:w="1663"/>
+          </w:tcPr>
+          <w:p>
+            <w:r>
+              <w:rPr>
+                <w:rFonts w:ascii="Times New Roman" w:hAnsi="Times New Roman"/>
+                <w:sz w:val="20"/>
+              </w:rPr>
+              <w:t>20</w:t>
+            </w:r>
+          </w:p>
+        </w:tc>
+        <w:tc>
+          <w:tcPr>
+            <w:tcW w:type="dxa" w:w="1663"/>
+          </w:tcPr>
+          <w:p>
+            <w:r>
+              <w:rPr>
+                <w:rFonts w:ascii="Times New Roman" w:hAnsi="Times New Roman"/>
+                <w:sz w:val="20"/>
+              </w:rPr>
+              <w:t>*</w:t>
+            </w:r>
+          </w:p>
+        </w:tc>
+      </w:tr>
+      <w:tr>
+        <w:tc>
+          <w:tcPr>
+            <w:tcW w:type="dxa" w:w="1663"/>
+          </w:tcPr>
+          <w:p>
+            <w:r>
+              <w:rPr>
+                <w:rFonts w:ascii="Times New Roman" w:hAnsi="Times New Roman"/>
+                <w:sz w:val="20"/>
+              </w:rPr>
+              <w:t>Part_Supply</w:t>
+            </w:r>
+          </w:p>
+        </w:tc>
+        <w:tc>
+          <w:tcPr>
+            <w:tcW w:type="dxa" w:w="1663"/>
+          </w:tcPr>
+          <w:p>
+            <w:r>
+              <w:rPr>
+                <w:rFonts w:ascii="Times New Roman" w:hAnsi="Times New Roman"/>
+                <w:sz w:val="20"/>
+              </w:rPr>
+              <w:t>КодПоставщика</w:t>
+            </w:r>
+          </w:p>
+        </w:tc>
+        <w:tc>
+          <w:tcPr>
+            <w:tcW w:type="dxa" w:w="1663"/>
+          </w:tcPr>
+          <w:p>
+            <w:r>
+              <w:rPr>
+                <w:rFonts w:ascii="Times New Roman" w:hAnsi="Times New Roman"/>
+                <w:sz w:val="20"/>
+              </w:rPr>
+              <w:t>supplier_id</w:t>
+            </w:r>
+          </w:p>
+        </w:tc>
+        <w:tc>
+          <w:tcPr>
+            <w:tcW w:type="dxa" w:w="1663"/>
+          </w:tcPr>
+          <w:p>
+            <w:r>
+              <w:rPr>
+                <w:rFonts w:ascii="Times New Roman" w:hAnsi="Times New Roman"/>
+                <w:sz w:val="20"/>
+              </w:rPr>
+              <w:t>I</w:t>
+            </w:r>
+          </w:p>
+        </w:tc>
+        <w:tc>
+          <w:tcPr>
+            <w:tcW w:type="dxa" w:w="1663"/>
+          </w:tcPr>
+          <w:p>
+            <w:r>
+              <w:rPr>
+                <w:rFonts w:ascii="Times New Roman" w:hAnsi="Times New Roman"/>
+                <w:sz w:val="20"/>
+              </w:rPr>
+              <w:t>20</w:t>
+            </w:r>
+          </w:p>
+        </w:tc>
+        <w:tc>
+          <w:tcPr>
+            <w:tcW w:type="dxa" w:w="1663"/>
+          </w:tcPr>
+          <w:p>
+            <w:r>
+              <w:rPr>
+                <w:rFonts w:ascii="Times New Roman" w:hAnsi="Times New Roman"/>
+                <w:sz w:val="20"/>
+              </w:rPr>
+            </w:r>
+          </w:p>
+        </w:tc>
+      </w:tr>
+      <w:tr>
+        <w:tc>
+          <w:tcPr>
+            <w:tcW w:type="dxa" w:w="1663"/>
+          </w:tcPr>
+          <w:p>
+            <w:r>
+              <w:rPr>
+                <w:rFonts w:ascii="Times New Roman" w:hAnsi="Times New Roman"/>
+                <w:sz w:val="20"/>
+              </w:rPr>
+              <w:t>Part_Supply</w:t>
+            </w:r>
+          </w:p>
+        </w:tc>
+        <w:tc>
+          <w:tcPr>
+            <w:tcW w:type="dxa" w:w="1663"/>
+          </w:tcPr>
+          <w:p>
+            <w:r>
+              <w:rPr>
+                <w:rFonts w:ascii="Times New Roman" w:hAnsi="Times New Roman"/>
+                <w:sz w:val="20"/>
+              </w:rPr>
+              <w:t>КодДетали</w:t>
+            </w:r>
+          </w:p>
+        </w:tc>
+        <w:tc>
+          <w:tcPr>
+            <w:tcW w:type="dxa" w:w="1663"/>
+          </w:tcPr>
+          <w:p>
+            <w:r>
+              <w:rPr>
+                <w:rFonts w:ascii="Times New Roman" w:hAnsi="Times New Roman"/>
+                <w:sz w:val="20"/>
+              </w:rPr>
+              <w:t>part_id</w:t>
+            </w:r>
+          </w:p>
+        </w:tc>
+        <w:tc>
+          <w:tcPr>
+            <w:tcW w:type="dxa" w:w="1663"/>
+          </w:tcPr>
+          <w:p>
+            <w:r>
+              <w:rPr>
+                <w:rFonts w:ascii="Times New Roman" w:hAnsi="Times New Roman"/>
+                <w:sz w:val="20"/>
+              </w:rPr>
+              <w:t>I</w:t>
+            </w:r>
+          </w:p>
+        </w:tc>
+        <w:tc>
+          <w:tcPr>
+            <w:tcW w:type="dxa" w:w="1663"/>
+          </w:tcPr>
+          <w:p>
+            <w:r>
+              <w:rPr>
+                <w:rFonts w:ascii="Times New Roman" w:hAnsi="Times New Roman"/>
+                <w:sz w:val="20"/>
+              </w:rPr>
+              <w:t>20</w:t>
+            </w:r>
+          </w:p>
+        </w:tc>
+        <w:tc>
+          <w:tcPr>
+            <w:tcW w:type="dxa" w:w="1663"/>
+          </w:tcPr>
+          <w:p>
+            <w:r>
+              <w:rPr>
+                <w:rFonts w:ascii="Times New Roman" w:hAnsi="Times New Roman"/>
+                <w:sz w:val="20"/>
+              </w:rPr>
+            </w:r>
+          </w:p>
+        </w:tc>
+      </w:tr>
+      <w:tr>
+        <w:tc>
+          <w:tcPr>
+            <w:tcW w:type="dxa" w:w="1663"/>
+          </w:tcPr>
+          <w:p>
+            <w:r>
+              <w:rPr>
+                <w:rFonts w:ascii="Times New Roman" w:hAnsi="Times New Roman"/>
+                <w:sz w:val="20"/>
+              </w:rPr>
+              <w:t>Part_Supply</w:t>
+            </w:r>
+          </w:p>
+        </w:tc>
+        <w:tc>
+          <w:tcPr>
+            <w:tcW w:type="dxa" w:w="1663"/>
+          </w:tcPr>
+          <w:p>
+            <w:r>
+              <w:rPr>
+                <w:rFonts w:ascii="Times New Roman" w:hAnsi="Times New Roman"/>
+                <w:sz w:val="20"/>
+              </w:rPr>
+              <w:t>Количество</w:t>
+            </w:r>
+          </w:p>
+        </w:tc>
+        <w:tc>
+          <w:tcPr>
+            <w:tcW w:type="dxa" w:w="1663"/>
+          </w:tcPr>
+          <w:p>
+            <w:r>
+              <w:rPr>
+                <w:rFonts w:ascii="Times New Roman" w:hAnsi="Times New Roman"/>
+                <w:sz w:val="20"/>
+              </w:rPr>
+              <w:t>quantity</w:t>
+            </w:r>
+          </w:p>
+        </w:tc>
+        <w:tc>
+          <w:tcPr>
+            <w:tcW w:type="dxa" w:w="1663"/>
+          </w:tcPr>
+          <w:p>
+            <w:r>
+              <w:rPr>
+                <w:rFonts w:ascii="Times New Roman" w:hAnsi="Times New Roman"/>
+                <w:sz w:val="20"/>
+              </w:rPr>
+              <w:t>I</w:t>
+            </w:r>
+          </w:p>
+        </w:tc>
+        <w:tc>
+          <w:tcPr>
+            <w:tcW w:type="dxa" w:w="1663"/>
+          </w:tcPr>
+          <w:p>
+            <w:r>
+              <w:rPr>
+                <w:rFonts w:ascii="Times New Roman" w:hAnsi="Times New Roman"/>
+                <w:sz w:val="20"/>
+              </w:rPr>
+              <w:t>20</w:t>
+            </w:r>
+          </w:p>
+        </w:tc>
+        <w:tc>
+          <w:tcPr>
+            <w:tcW w:type="dxa" w:w="1663"/>
+          </w:tcPr>
+          <w:p>
+            <w:r>
+              <w:rPr>
+                <w:rFonts w:ascii="Times New Roman" w:hAnsi="Times New Roman"/>
+                <w:sz w:val="20"/>
+              </w:rPr>
+            </w:r>
+          </w:p>
+        </w:tc>
+      </w:tr>
+      <w:tr>
+        <w:tc>
+          <w:tcPr>
+            <w:tcW w:type="dxa" w:w="1663"/>
+          </w:tcPr>
+          <w:p>
+            <w:r>
+              <w:rPr>
+                <w:rFonts w:ascii="Times New Roman" w:hAnsi="Times New Roman"/>
+                <w:sz w:val="20"/>
+              </w:rPr>
+              <w:t>Part_Supply</w:t>
+            </w:r>
+          </w:p>
+        </w:tc>
+        <w:tc>
+          <w:tcPr>
+            <w:tcW w:type="dxa" w:w="1663"/>
+          </w:tcPr>
+          <w:p>
+            <w:r>
+              <w:rPr>
+                <w:rFonts w:ascii="Times New Roman" w:hAnsi="Times New Roman"/>
+                <w:sz w:val="20"/>
+              </w:rPr>
+              <w:t>Цена</w:t>
+            </w:r>
+          </w:p>
+        </w:tc>
+        <w:tc>
+          <w:tcPr>
+            <w:tcW w:type="dxa" w:w="1663"/>
+          </w:tcPr>
+          <w:p>
+            <w:r>
+              <w:rPr>
+                <w:rFonts w:ascii="Times New Roman" w:hAnsi="Times New Roman"/>
+                <w:sz w:val="20"/>
+              </w:rPr>
+              <w:t>price</w:t>
+            </w:r>
+          </w:p>
+        </w:tc>
+        <w:tc>
+          <w:tcPr>
+            <w:tcW w:type="dxa" w:w="1663"/>
+          </w:tcPr>
+          <w:p>
+            <w:r>
+              <w:rPr>
+                <w:rFonts w:ascii="Times New Roman" w:hAnsi="Times New Roman"/>
+                <w:sz w:val="20"/>
+              </w:rPr>
+              <w:t>R</w:t>
+            </w:r>
+          </w:p>
+        </w:tc>
+        <w:tc>
+          <w:tcPr>
+            <w:tcW w:type="dxa" w:w="1663"/>
+          </w:tcPr>
+          <w:p>
+            <w:r>
+              <w:rPr>
+                <w:rFonts w:ascii="Times New Roman" w:hAnsi="Times New Roman"/>
+                <w:sz w:val="20"/>
+              </w:rPr>
+              <w:t>20</w:t>
+            </w:r>
+          </w:p>
+        </w:tc>
+        <w:tc>
+          <w:tcPr>
+            <w:tcW w:type="dxa" w:w="1663"/>
+          </w:tcPr>
+          <w:p>
+            <w:r>
+              <w:rPr>
+                <w:rFonts w:ascii="Times New Roman" w:hAnsi="Times New Roman"/>
+                <w:sz w:val="20"/>
+              </w:rPr>
+            </w:r>
+          </w:p>
+        </w:tc>
+      </w:tr>
+      <w:tr>
+        <w:tc>
+          <w:tcPr>
+            <w:tcW w:type="dxa" w:w="1663"/>
+          </w:tcPr>
+          <w:p>
+            <w:r>
+              <w:rPr>
+                <w:rFonts w:ascii="Times New Roman" w:hAnsi="Times New Roman"/>
+                <w:sz w:val="20"/>
+              </w:rPr>
+              <w:t>Part_Supply</w:t>
+            </w:r>
+          </w:p>
+        </w:tc>
+        <w:tc>
+          <w:tcPr>
+            <w:tcW w:type="dxa" w:w="1663"/>
+          </w:tcPr>
+          <w:p>
+            <w:r>
+              <w:rPr>
+                <w:rFonts w:ascii="Times New Roman" w:hAnsi="Times New Roman"/>
+                <w:sz w:val="20"/>
+              </w:rPr>
+              <w:t>Дата поставки</w:t>
+            </w:r>
+          </w:p>
+        </w:tc>
+        <w:tc>
+          <w:tcPr>
+            <w:tcW w:type="dxa" w:w="1663"/>
+          </w:tcPr>
+          <w:p>
+            <w:r>
+              <w:rPr>
+                <w:rFonts w:ascii="Times New Roman" w:hAnsi="Times New Roman"/>
+                <w:sz w:val="20"/>
+              </w:rPr>
+              <w:t>supply_date</w:t>
+            </w:r>
+          </w:p>
+        </w:tc>
+        <w:tc>
+          <w:tcPr>
+            <w:tcW w:type="dxa" w:w="1663"/>
+          </w:tcPr>
+          <w:p>
+            <w:r>
+              <w:rPr>
+                <w:rFonts w:ascii="Times New Roman" w:hAnsi="Times New Roman"/>
+                <w:sz w:val="20"/>
+              </w:rPr>
+              <w:t>S</w:t>
+            </w:r>
+          </w:p>
+        </w:tc>
+        <w:tc>
+          <w:tcPr>
+            <w:tcW w:type="dxa" w:w="1663"/>
+          </w:tcPr>
+          <w:p>
+            <w:r>
+              <w:rPr>
+                <w:rFonts w:ascii="Times New Roman" w:hAnsi="Times New Roman"/>
+                <w:sz w:val="20"/>
+              </w:rPr>
+              <w:t>50</w:t>
+            </w:r>
+          </w:p>
+        </w:tc>
+        <w:tc>
+          <w:tcPr>
+            <w:tcW w:type="dxa" w:w="1663"/>
+          </w:tcPr>
+          <w:p>
+            <w:r>
+              <w:rPr>
+                <w:rFonts w:ascii="Times New Roman" w:hAnsi="Times New Roman"/>
+                <w:sz w:val="20"/>
+              </w:rPr>
+            </w:r>
+          </w:p>
+        </w:tc>
+      </w:tr>
+      <w:tr>
+        <w:tc>
+          <w:tcPr>
+            <w:tcW w:type="dxa" w:w="1663"/>
+          </w:tcPr>
+          <w:p>
+            <w:r>
+              <w:rPr>
+                <w:rFonts w:ascii="Times New Roman" w:hAnsi="Times New Roman"/>
+                <w:sz w:val="20"/>
+              </w:rPr>
               <w:t>Product</w:t>
             </w:r>
           </w:p>
@@ -1386,6 +2435,91 @@
                 <w:sz w:val="20"/>
               </w:rPr>
               <w:t>name</w:t>
+            </w:r>
+          </w:p>
+        </w:tc>
+        <w:tc>
+          <w:tcPr>
+            <w:tcW w:type="dxa" w:w="1663"/>
+          </w:tcPr>
+          <w:p>
+            <w:r>
+              <w:rPr>
+                <w:rFonts w:ascii="Times New Roman" w:hAnsi="Times New Roman"/>
+                <w:sz w:val="20"/>
+              </w:rPr>
+              <w:t>S</w:t>
+            </w:r>
+          </w:p>
+        </w:tc>
+        <w:tc>
+          <w:tcPr>
+            <w:tcW w:type="dxa" w:w="1663"/>
+          </w:tcPr>
+          <w:p>
+            <w:r>
+              <w:rPr>
+                <w:rFonts w:ascii="Times New Roman" w:hAnsi="Times New Roman"/>
+                <w:sz w:val="20"/>
+              </w:rPr>
+              <w:t>255</w:t>
+            </w:r>
+          </w:p>
+        </w:tc>
+        <w:tc>
+          <w:tcPr>
+            <w:tcW w:type="dxa" w:w="1663"/>
+          </w:tcPr>
+          <w:p>
+            <w:r>
+              <w:rPr>
+                <w:rFonts w:ascii="Times New Roman" w:hAnsi="Times New Roman"/>
+                <w:sz w:val="20"/>
+              </w:rPr>
+            </w:r>
+          </w:p>
+        </w:tc>
+      </w:tr>
+      <w:tr>
+        <w:tc>
+          <w:tcPr>
+            <w:tcW w:type="dxa" w:w="1663"/>
+          </w:tcPr>
+          <w:p>
+            <w:r>
+              <w:rPr>
+                <w:rFonts w:ascii="Times New Roman" w:hAnsi="Times New Roman"/>
+                <w:sz w:val="20"/>
+              </w:rPr>
+              <w:t>Product</w:t>
+            </w:r>
+          </w:p>
+        </w:tc>
+        <w:tc>
+          <w:tcPr>
+            <w:tcW w:type="dxa" w:w="1663"/>
+          </w:tcPr>
+          <w:p>
+            <w:r>
+              <w:rPr>
+                <w:rFonts w:ascii="Times New Roman" w:hAnsi="Times New Roman"/>
+                <w:sz w:val="20"/>
+              </w:rPr>
+              <w:t>Описание</w:t>
+            </w:r>
+          </w:p>
+        </w:tc>
+        <w:tc>
+          <w:tcPr>
+            <w:tcW w:type="dxa" w:w="1663"/>
+          </w:tcPr>
+          <w:p>
+            <w:r>
+              <w:rPr>
+                <w:rFonts w:ascii="Times New Roman" w:hAnsi="Times New Roman"/>
+                <w:sz w:val="20"/>
+              </w:rPr>
+              <w:t>description</w:t>
             </w:r>
           </w:p>
         </w:tc>
@@ -1884,6 +3018,432 @@
                 <w:rFonts w:ascii="Times New Roman" w:hAnsi="Times New Roman"/>
                 <w:sz w:val="20"/>
               </w:rPr>
+              <w:t>КодДетали</w:t>
+            </w:r>
+          </w:p>
+        </w:tc>
+        <w:tc>
+          <w:tcPr>
+            <w:tcW w:type="dxa" w:w="1663"/>
+          </w:tcPr>
+          <w:p>
+            <w:r>
+              <w:rPr>
+                <w:rFonts w:ascii="Times New Roman" w:hAnsi="Times New Roman"/>
+                <w:sz w:val="20"/>
+              </w:rPr>
+              <w:t>part_id</w:t>
+            </w:r>
+          </w:p>
+        </w:tc>
+        <w:tc>
+          <w:tcPr>
+            <w:tcW w:type="dxa" w:w="1663"/>
+          </w:tcPr>
+          <w:p>
+            <w:r>
+              <w:rPr>
+                <w:rFonts w:ascii="Times New Roman" w:hAnsi="Times New Roman"/>
+                <w:sz w:val="20"/>
+              </w:rPr>
+              <w:t>I</w:t>
+            </w:r>
+          </w:p>
+        </w:tc>
+        <w:tc>
+          <w:tcPr>
+            <w:tcW w:type="dxa" w:w="1663"/>
+          </w:tcPr>
+          <w:p>
+            <w:r>
+              <w:rPr>
+                <w:rFonts w:ascii="Times New Roman" w:hAnsi="Times New Roman"/>
+                <w:sz w:val="20"/>
+              </w:rPr>
+              <w:t>20</w:t>
+            </w:r>
+          </w:p>
+        </w:tc>
+        <w:tc>
+          <w:tcPr>
+            <w:tcW w:type="dxa" w:w="1663"/>
+          </w:tcPr>
+          <w:p>
+            <w:r>
+              <w:rPr>
+                <w:rFonts w:ascii="Times New Roman" w:hAnsi="Times New Roman"/>
+                <w:sz w:val="20"/>
+              </w:rPr>
+            </w:r>
+          </w:p>
+        </w:tc>
+      </w:tr>
+      <w:tr>
+        <w:tc>
+          <w:tcPr>
+            <w:tcW w:type="dxa" w:w="1663"/>
+          </w:tcPr>
+          <w:p>
+            <w:r>
+              <w:rPr>
+                <w:rFonts w:ascii="Times New Roman" w:hAnsi="Times New Roman"/>
+                <w:sz w:val="20"/>
+              </w:rPr>
+              <w:t>Part_Cell</w:t>
+            </w:r>
+          </w:p>
+        </w:tc>
+        <w:tc>
+          <w:tcPr>
+            <w:tcW w:type="dxa" w:w="1663"/>
+          </w:tcPr>
+          <w:p>
+            <w:r>
+              <w:rPr>
+                <w:rFonts w:ascii="Times New Roman" w:hAnsi="Times New Roman"/>
+                <w:sz w:val="20"/>
+              </w:rPr>
+              <w:t>Количество</w:t>
+            </w:r>
+          </w:p>
+        </w:tc>
+        <w:tc>
+          <w:tcPr>
+            <w:tcW w:type="dxa" w:w="1663"/>
+          </w:tcPr>
+          <w:p>
+            <w:r>
+              <w:rPr>
+                <w:rFonts w:ascii="Times New Roman" w:hAnsi="Times New Roman"/>
+                <w:sz w:val="20"/>
+              </w:rPr>
+              <w:t>quantity_stored</w:t>
+            </w:r>
+          </w:p>
+        </w:tc>
+        <w:tc>
+          <w:tcPr>
+            <w:tcW w:type="dxa" w:w="1663"/>
+          </w:tcPr>
+          <w:p>
+            <w:r>
+              <w:rPr>
+                <w:rFonts w:ascii="Times New Roman" w:hAnsi="Times New Roman"/>
+                <w:sz w:val="20"/>
+              </w:rPr>
+              <w:t>I</w:t>
+            </w:r>
+          </w:p>
+        </w:tc>
+        <w:tc>
+          <w:tcPr>
+            <w:tcW w:type="dxa" w:w="1663"/>
+          </w:tcPr>
+          <w:p>
+            <w:r>
+              <w:rPr>
+                <w:rFonts w:ascii="Times New Roman" w:hAnsi="Times New Roman"/>
+                <w:sz w:val="20"/>
+              </w:rPr>
+              <w:t>20</w:t>
+            </w:r>
+          </w:p>
+        </w:tc>
+        <w:tc>
+          <w:tcPr>
+            <w:tcW w:type="dxa" w:w="1663"/>
+          </w:tcPr>
+          <w:p>
+            <w:r>
+              <w:rPr>
+                <w:rFonts w:ascii="Times New Roman" w:hAnsi="Times New Roman"/>
+                <w:sz w:val="20"/>
+              </w:rPr>
+            </w:r>
+          </w:p>
+        </w:tc>
+      </w:tr>
+      <w:tr>
+        <w:tc>
+          <w:tcPr>
+            <w:tcW w:type="dxa" w:w="1663"/>
+          </w:tcPr>
+          <w:p>
+            <w:r>
+              <w:rPr>
+                <w:rFonts w:ascii="Times New Roman" w:hAnsi="Times New Roman"/>
+                <w:sz w:val="20"/>
+              </w:rPr>
+              <w:t>Prod_Cell</w:t>
+            </w:r>
+          </w:p>
+        </w:tc>
+        <w:tc>
+          <w:tcPr>
+            <w:tcW w:type="dxa" w:w="1663"/>
+          </w:tcPr>
+          <w:p>
+            <w:r>
+              <w:rPr>
+                <w:rFonts w:ascii="Times New Roman" w:hAnsi="Times New Roman"/>
+                <w:sz w:val="20"/>
+              </w:rPr>
+              <w:t>КодЯчейкиИзделий</w:t>
+            </w:r>
+          </w:p>
+        </w:tc>
+        <w:tc>
+          <w:tcPr>
+            <w:tcW w:type="dxa" w:w="1663"/>
+          </w:tcPr>
+          <w:p>
+            <w:r>
+              <w:rPr>
+                <w:rFonts w:ascii="Times New Roman" w:hAnsi="Times New Roman"/>
+                <w:sz w:val="20"/>
+              </w:rPr>
+              <w:t>id_product_cell</w:t>
+            </w:r>
+          </w:p>
+        </w:tc>
+        <w:tc>
+          <w:tcPr>
+            <w:tcW w:type="dxa" w:w="1663"/>
+          </w:tcPr>
+          <w:p>
+            <w:r>
+              <w:rPr>
+                <w:rFonts w:ascii="Times New Roman" w:hAnsi="Times New Roman"/>
+                <w:sz w:val="20"/>
+              </w:rPr>
+              <w:t>I</w:t>
+            </w:r>
+          </w:p>
+        </w:tc>
+        <w:tc>
+          <w:tcPr>
+            <w:tcW w:type="dxa" w:w="1663"/>
+          </w:tcPr>
+          <w:p>
+            <w:r>
+              <w:rPr>
+                <w:rFonts w:ascii="Times New Roman" w:hAnsi="Times New Roman"/>
+                <w:sz w:val="20"/>
+              </w:rPr>
+              <w:t>20</w:t>
+            </w:r>
+          </w:p>
+        </w:tc>
+        <w:tc>
+          <w:tcPr>
+            <w:tcW w:type="dxa" w:w="1663"/>
+          </w:tcPr>
+          <w:p>
+            <w:r>
+              <w:rPr>
+                <w:rFonts w:ascii="Times New Roman" w:hAnsi="Times New Roman"/>
+                <w:sz w:val="20"/>
+              </w:rPr>
+              <w:t>*</w:t>
+            </w:r>
+          </w:p>
+        </w:tc>
+      </w:tr>
+      <w:tr>
+        <w:tc>
+          <w:tcPr>
+            <w:tcW w:type="dxa" w:w="1663"/>
+          </w:tcPr>
+          <w:p>
+            <w:r>
+              <w:rPr>
+                <w:rFonts w:ascii="Times New Roman" w:hAnsi="Times New Roman"/>
+                <w:sz w:val="20"/>
+              </w:rPr>
+              <w:t>Prod_Cell</w:t>
+            </w:r>
+          </w:p>
+        </w:tc>
+        <w:tc>
+          <w:tcPr>
+            <w:tcW w:type="dxa" w:w="1663"/>
+          </w:tcPr>
+          <w:p>
+            <w:r>
+              <w:rPr>
+                <w:rFonts w:ascii="Times New Roman" w:hAnsi="Times New Roman"/>
+                <w:sz w:val="20"/>
+              </w:rPr>
+              <w:t>НомерЯчейки</w:t>
+            </w:r>
+          </w:p>
+        </w:tc>
+        <w:tc>
+          <w:tcPr>
+            <w:tcW w:type="dxa" w:w="1663"/>
+          </w:tcPr>
+          <w:p>
+            <w:r>
+              <w:rPr>
+                <w:rFonts w:ascii="Times New Roman" w:hAnsi="Times New Roman"/>
+                <w:sz w:val="20"/>
+              </w:rPr>
+              <w:t>cell_number</w:t>
+            </w:r>
+          </w:p>
+        </w:tc>
+        <w:tc>
+          <w:tcPr>
+            <w:tcW w:type="dxa" w:w="1663"/>
+          </w:tcPr>
+          <w:p>
+            <w:r>
+              <w:rPr>
+                <w:rFonts w:ascii="Times New Roman" w:hAnsi="Times New Roman"/>
+                <w:sz w:val="20"/>
+              </w:rPr>
+              <w:t>S</w:t>
+            </w:r>
+          </w:p>
+        </w:tc>
+        <w:tc>
+          <w:tcPr>
+            <w:tcW w:type="dxa" w:w="1663"/>
+          </w:tcPr>
+          <w:p>
+            <w:r>
+              <w:rPr>
+                <w:rFonts w:ascii="Times New Roman" w:hAnsi="Times New Roman"/>
+                <w:sz w:val="20"/>
+              </w:rPr>
+              <w:t>255</w:t>
+            </w:r>
+          </w:p>
+        </w:tc>
+        <w:tc>
+          <w:tcPr>
+            <w:tcW w:type="dxa" w:w="1663"/>
+          </w:tcPr>
+          <w:p>
+            <w:r>
+              <w:rPr>
+                <w:rFonts w:ascii="Times New Roman" w:hAnsi="Times New Roman"/>
+                <w:sz w:val="20"/>
+              </w:rPr>
+            </w:r>
+          </w:p>
+        </w:tc>
+      </w:tr>
+      <w:tr>
+        <w:tc>
+          <w:tcPr>
+            <w:tcW w:type="dxa" w:w="1663"/>
+          </w:tcPr>
+          <w:p>
+            <w:r>
+              <w:rPr>
+                <w:rFonts w:ascii="Times New Roman" w:hAnsi="Times New Roman"/>
+                <w:sz w:val="20"/>
+              </w:rPr>
+              <w:t>Prod_Cell</w:t>
+            </w:r>
+          </w:p>
+        </w:tc>
+        <w:tc>
+          <w:tcPr>
+            <w:tcW w:type="dxa" w:w="1663"/>
+          </w:tcPr>
+          <w:p>
+            <w:r>
+              <w:rPr>
+                <w:rFonts w:ascii="Times New Roman" w:hAnsi="Times New Roman"/>
+                <w:sz w:val="20"/>
+              </w:rPr>
+              <w:t>КодИзделия</w:t>
+            </w:r>
+          </w:p>
+        </w:tc>
+        <w:tc>
+          <w:tcPr>
+            <w:tcW w:type="dxa" w:w="1663"/>
+          </w:tcPr>
+          <w:p>
+            <w:r>
+              <w:rPr>
+                <w:rFonts w:ascii="Times New Roman" w:hAnsi="Times New Roman"/>
+                <w:sz w:val="20"/>
+              </w:rPr>
+              <w:t>product_type_id</w:t>
+            </w:r>
+          </w:p>
+        </w:tc>
+        <w:tc>
+          <w:tcPr>
+            <w:tcW w:type="dxa" w:w="1663"/>
+          </w:tcPr>
+          <w:p>
+            <w:r>
+              <w:rPr>
+                <w:rFonts w:ascii="Times New Roman" w:hAnsi="Times New Roman"/>
+                <w:sz w:val="20"/>
+              </w:rPr>
+              <w:t>I</w:t>
+            </w:r>
+          </w:p>
+        </w:tc>
+        <w:tc>
+          <w:tcPr>
+            <w:tcW w:type="dxa" w:w="1663"/>
+          </w:tcPr>
+          <w:p>
+            <w:r>
+              <w:rPr>
+                <w:rFonts w:ascii="Times New Roman" w:hAnsi="Times New Roman"/>
+                <w:sz w:val="20"/>
+              </w:rPr>
+              <w:t>20</w:t>
+            </w:r>
+          </w:p>
+        </w:tc>
+        <w:tc>
+          <w:tcPr>
+            <w:tcW w:type="dxa" w:w="1663"/>
+          </w:tcPr>
+          <w:p>
+            <w:r>
+              <w:rPr>
+                <w:rFonts w:ascii="Times New Roman" w:hAnsi="Times New Roman"/>
+                <w:sz w:val="20"/>
+              </w:rPr>
+            </w:r>
+          </w:p>
+        </w:tc>
+      </w:tr>
+      <w:tr>
+        <w:tc>
+          <w:tcPr>
+            <w:tcW w:type="dxa" w:w="1663"/>
+          </w:tcPr>
+          <w:p>
+            <w:r>
+              <w:rPr>
+                <w:rFonts w:ascii="Times New Roman" w:hAnsi="Times New Roman"/>
+                <w:sz w:val="20"/>
+              </w:rPr>
+              <w:t>Prod_Cell</w:t>
+            </w:r>
+          </w:p>
+        </w:tc>
+        <w:tc>
+          <w:tcPr>
+            <w:tcW w:type="dxa" w:w="1663"/>
+          </w:tcPr>
+          <w:p>
+            <w:r>
+              <w:rPr>
+                <w:rFonts w:ascii="Times New Roman" w:hAnsi="Times New Roman"/>
+                <w:sz w:val="20"/>
+              </w:rPr>
               <w:t>Количество</w:t>
             </w:r>
           </w:p>
@@ -2115,6 +3675,517 @@
           </w:p>
         </w:tc>
       </w:tr>
+      <w:tr>
+        <w:tc>
+          <w:tcPr>
+            <w:tcW w:type="dxa" w:w="1663"/>
+          </w:tcPr>
+          <w:p>
+            <w:r>
+              <w:rPr>
+                <w:rFonts w:ascii="Times New Roman" w:hAnsi="Times New Roman"/>
+                <w:sz w:val="20"/>
+              </w:rPr>
+              <w:t>Client_Order</w:t>
+            </w:r>
+          </w:p>
+        </w:tc>
+        <w:tc>
+          <w:tcPr>
+            <w:tcW w:type="dxa" w:w="1663"/>
+          </w:tcPr>
+          <w:p>
+            <w:r>
+              <w:rPr>
+                <w:rFonts w:ascii="Times New Roman" w:hAnsi="Times New Roman"/>
+                <w:sz w:val="20"/>
+              </w:rPr>
+              <w:t>КодЗаказа</w:t>
+            </w:r>
+          </w:p>
+        </w:tc>
+        <w:tc>
+          <w:tcPr>
+            <w:tcW w:type="dxa" w:w="1663"/>
+          </w:tcPr>
+          <w:p>
+            <w:r>
+              <w:rPr>
+                <w:rFonts w:ascii="Times New Roman" w:hAnsi="Times New Roman"/>
+                <w:sz w:val="20"/>
+              </w:rPr>
+              <w:t>id_order</w:t>
+            </w:r>
+          </w:p>
+        </w:tc>
+        <w:tc>
+          <w:tcPr>
+            <w:tcW w:type="dxa" w:w="1663"/>
+          </w:tcPr>
+          <w:p>
+            <w:r>
+              <w:rPr>
+                <w:rFonts w:ascii="Times New Roman" w:hAnsi="Times New Roman"/>
+                <w:sz w:val="20"/>
+              </w:rPr>
+              <w:t>I</w:t>
+            </w:r>
+          </w:p>
+        </w:tc>
+        <w:tc>
+          <w:tcPr>
+            <w:tcW w:type="dxa" w:w="1663"/>
+          </w:tcPr>
+          <w:p>
+            <w:r>
+              <w:rPr>
+                <w:rFonts w:ascii="Times New Roman" w:hAnsi="Times New Roman"/>
+                <w:sz w:val="20"/>
+              </w:rPr>
+              <w:t>20</w:t>
+            </w:r>
+          </w:p>
+        </w:tc>
+        <w:tc>
+          <w:tcPr>
+            <w:tcW w:type="dxa" w:w="1663"/>
+          </w:tcPr>
+          <w:p>
+            <w:r>
+              <w:rPr>
+                <w:rFonts w:ascii="Times New Roman" w:hAnsi="Times New Roman"/>
+                <w:sz w:val="20"/>
+              </w:rPr>
+              <w:t>*</w:t>
+            </w:r>
+          </w:p>
+        </w:tc>
+      </w:tr>
+      <w:tr>
+        <w:tc>
+          <w:tcPr>
+            <w:tcW w:type="dxa" w:w="1663"/>
+          </w:tcPr>
+          <w:p>
+            <w:r>
+              <w:rPr>
+                <w:rFonts w:ascii="Times New Roman" w:hAnsi="Times New Roman"/>
+                <w:sz w:val="20"/>
+              </w:rPr>
+              <w:t>Client_Order</w:t>
+            </w:r>
+          </w:p>
+        </w:tc>
+        <w:tc>
+          <w:tcPr>
+            <w:tcW w:type="dxa" w:w="1663"/>
+          </w:tcPr>
+          <w:p>
+            <w:r>
+              <w:rPr>
+                <w:rFonts w:ascii="Times New Roman" w:hAnsi="Times New Roman"/>
+                <w:sz w:val="20"/>
+              </w:rPr>
+              <w:t>ИмяКлиента</w:t>
+            </w:r>
+          </w:p>
+        </w:tc>
+        <w:tc>
+          <w:tcPr>
+            <w:tcW w:type="dxa" w:w="1663"/>
+          </w:tcPr>
+          <w:p>
+            <w:r>
+              <w:rPr>
+                <w:rFonts w:ascii="Times New Roman" w:hAnsi="Times New Roman"/>
+                <w:sz w:val="20"/>
+              </w:rPr>
+              <w:t>customer_name</w:t>
+            </w:r>
+          </w:p>
+        </w:tc>
+        <w:tc>
+          <w:tcPr>
+            <w:tcW w:type="dxa" w:w="1663"/>
+          </w:tcPr>
+          <w:p>
+            <w:r>
+              <w:rPr>
+                <w:rFonts w:ascii="Times New Roman" w:hAnsi="Times New Roman"/>
+                <w:sz w:val="20"/>
+              </w:rPr>
+              <w:t>S</w:t>
+            </w:r>
+          </w:p>
+        </w:tc>
+        <w:tc>
+          <w:tcPr>
+            <w:tcW w:type="dxa" w:w="1663"/>
+          </w:tcPr>
+          <w:p>
+            <w:r>
+              <w:rPr>
+                <w:rFonts w:ascii="Times New Roman" w:hAnsi="Times New Roman"/>
+                <w:sz w:val="20"/>
+              </w:rPr>
+              <w:t>255</w:t>
+            </w:r>
+          </w:p>
+        </w:tc>
+        <w:tc>
+          <w:tcPr>
+            <w:tcW w:type="dxa" w:w="1663"/>
+          </w:tcPr>
+          <w:p>
+            <w:r>
+              <w:rPr>
+                <w:rFonts w:ascii="Times New Roman" w:hAnsi="Times New Roman"/>
+                <w:sz w:val="20"/>
+              </w:rPr>
+            </w:r>
+          </w:p>
+        </w:tc>
+      </w:tr>
+      <w:tr>
+        <w:tc>
+          <w:tcPr>
+            <w:tcW w:type="dxa" w:w="1663"/>
+          </w:tcPr>
+          <w:p>
+            <w:r>
+              <w:rPr>
+                <w:rFonts w:ascii="Times New Roman" w:hAnsi="Times New Roman"/>
+                <w:sz w:val="20"/>
+              </w:rPr>
+              <w:t>Client_Order</w:t>
+            </w:r>
+          </w:p>
+        </w:tc>
+        <w:tc>
+          <w:tcPr>
+            <w:tcW w:type="dxa" w:w="1663"/>
+          </w:tcPr>
+          <w:p>
+            <w:r>
+              <w:rPr>
+                <w:rFonts w:ascii="Times New Roman" w:hAnsi="Times New Roman"/>
+                <w:sz w:val="20"/>
+              </w:rPr>
+              <w:t>КодИзделия</w:t>
+            </w:r>
+          </w:p>
+        </w:tc>
+        <w:tc>
+          <w:tcPr>
+            <w:tcW w:type="dxa" w:w="1663"/>
+          </w:tcPr>
+          <w:p>
+            <w:r>
+              <w:rPr>
+                <w:rFonts w:ascii="Times New Roman" w:hAnsi="Times New Roman"/>
+                <w:sz w:val="20"/>
+              </w:rPr>
+              <w:t>product_type_id</w:t>
+            </w:r>
+          </w:p>
+        </w:tc>
+        <w:tc>
+          <w:tcPr>
+            <w:tcW w:type="dxa" w:w="1663"/>
+          </w:tcPr>
+          <w:p>
+            <w:r>
+              <w:rPr>
+                <w:rFonts w:ascii="Times New Roman" w:hAnsi="Times New Roman"/>
+                <w:sz w:val="20"/>
+              </w:rPr>
+              <w:t>I</w:t>
+            </w:r>
+          </w:p>
+        </w:tc>
+        <w:tc>
+          <w:tcPr>
+            <w:tcW w:type="dxa" w:w="1663"/>
+          </w:tcPr>
+          <w:p>
+            <w:r>
+              <w:rPr>
+                <w:rFonts w:ascii="Times New Roman" w:hAnsi="Times New Roman"/>
+                <w:sz w:val="20"/>
+              </w:rPr>
+              <w:t>20</w:t>
+            </w:r>
+          </w:p>
+        </w:tc>
+        <w:tc>
+          <w:tcPr>
+            <w:tcW w:type="dxa" w:w="1663"/>
+          </w:tcPr>
+          <w:p>
+            <w:r>
+              <w:rPr>
+                <w:rFonts w:ascii="Times New Roman" w:hAnsi="Times New Roman"/>
+                <w:sz w:val="20"/>
+              </w:rPr>
+            </w:r>
+          </w:p>
+        </w:tc>
+      </w:tr>
+      <w:tr>
+        <w:tc>
+          <w:tcPr>
+            <w:tcW w:type="dxa" w:w="1663"/>
+          </w:tcPr>
+          <w:p>
+            <w:r>
+              <w:rPr>
+                <w:rFonts w:ascii="Times New Roman" w:hAnsi="Times New Roman"/>
+                <w:sz w:val="20"/>
+              </w:rPr>
+              <w:t>Client_Order</w:t>
+            </w:r>
+          </w:p>
+        </w:tc>
+        <w:tc>
+          <w:tcPr>
+            <w:tcW w:type="dxa" w:w="1663"/>
+          </w:tcPr>
+          <w:p>
+            <w:r>
+              <w:rPr>
+                <w:rFonts w:ascii="Times New Roman" w:hAnsi="Times New Roman"/>
+                <w:sz w:val="20"/>
+              </w:rPr>
+              <w:t>Количество</w:t>
+            </w:r>
+          </w:p>
+        </w:tc>
+        <w:tc>
+          <w:tcPr>
+            <w:tcW w:type="dxa" w:w="1663"/>
+          </w:tcPr>
+          <w:p>
+            <w:r>
+              <w:rPr>
+                <w:rFonts w:ascii="Times New Roman" w:hAnsi="Times New Roman"/>
+                <w:sz w:val="20"/>
+              </w:rPr>
+              <w:t>quantity</w:t>
+            </w:r>
+          </w:p>
+        </w:tc>
+        <w:tc>
+          <w:tcPr>
+            <w:tcW w:type="dxa" w:w="1663"/>
+          </w:tcPr>
+          <w:p>
+            <w:r>
+              <w:rPr>
+                <w:rFonts w:ascii="Times New Roman" w:hAnsi="Times New Roman"/>
+                <w:sz w:val="20"/>
+              </w:rPr>
+              <w:t>I</w:t>
+            </w:r>
+          </w:p>
+        </w:tc>
+        <w:tc>
+          <w:tcPr>
+            <w:tcW w:type="dxa" w:w="1663"/>
+          </w:tcPr>
+          <w:p>
+            <w:r>
+              <w:rPr>
+                <w:rFonts w:ascii="Times New Roman" w:hAnsi="Times New Roman"/>
+                <w:sz w:val="20"/>
+              </w:rPr>
+              <w:t>20</w:t>
+            </w:r>
+          </w:p>
+        </w:tc>
+        <w:tc>
+          <w:tcPr>
+            <w:tcW w:type="dxa" w:w="1663"/>
+          </w:tcPr>
+          <w:p>
+            <w:r>
+              <w:rPr>
+                <w:rFonts w:ascii="Times New Roman" w:hAnsi="Times New Roman"/>
+                <w:sz w:val="20"/>
+              </w:rPr>
+            </w:r>
+          </w:p>
+        </w:tc>
+      </w:tr>
+      <w:tr>
+        <w:tc>
+          <w:tcPr>
+            <w:tcW w:type="dxa" w:w="1663"/>
+          </w:tcPr>
+          <w:p>
+            <w:r>
+              <w:rPr>
+                <w:rFonts w:ascii="Times New Roman" w:hAnsi="Times New Roman"/>
+                <w:sz w:val="20"/>
+              </w:rPr>
+              <w:t>Client_Order</w:t>
+            </w:r>
+          </w:p>
+        </w:tc>
+        <w:tc>
+          <w:tcPr>
+            <w:tcW w:type="dxa" w:w="1663"/>
+          </w:tcPr>
+          <w:p>
+            <w:r>
+              <w:rPr>
+                <w:rFonts w:ascii="Times New Roman" w:hAnsi="Times New Roman"/>
+                <w:sz w:val="20"/>
+              </w:rPr>
+              <w:t>Дата заказа</w:t>
+            </w:r>
+          </w:p>
+        </w:tc>
+        <w:tc>
+          <w:tcPr>
+            <w:tcW w:type="dxa" w:w="1663"/>
+          </w:tcPr>
+          <w:p>
+            <w:r>
+              <w:rPr>
+                <w:rFonts w:ascii="Times New Roman" w:hAnsi="Times New Roman"/>
+                <w:sz w:val="20"/>
+              </w:rPr>
+              <w:t>order_date</w:t>
+            </w:r>
+          </w:p>
+        </w:tc>
+        <w:tc>
+          <w:tcPr>
+            <w:tcW w:type="dxa" w:w="1663"/>
+          </w:tcPr>
+          <w:p>
+            <w:r>
+              <w:rPr>
+                <w:rFonts w:ascii="Times New Roman" w:hAnsi="Times New Roman"/>
+                <w:sz w:val="20"/>
+              </w:rPr>
+              <w:t>S</w:t>
+            </w:r>
+          </w:p>
+        </w:tc>
+        <w:tc>
+          <w:tcPr>
+            <w:tcW w:type="dxa" w:w="1663"/>
+          </w:tcPr>
+          <w:p>
+            <w:r>
+              <w:rPr>
+                <w:rFonts w:ascii="Times New Roman" w:hAnsi="Times New Roman"/>
+                <w:sz w:val="20"/>
+              </w:rPr>
+              <w:t>50</w:t>
+            </w:r>
+          </w:p>
+        </w:tc>
+        <w:tc>
+          <w:tcPr>
+            <w:tcW w:type="dxa" w:w="1663"/>
+          </w:tcPr>
+          <w:p>
+            <w:r>
+              <w:rPr>
+                <w:rFonts w:ascii="Times New Roman" w:hAnsi="Times New Roman"/>
+                <w:sz w:val="20"/>
+              </w:rPr>
+            </w:r>
+          </w:p>
+        </w:tc>
+      </w:tr>
+      <w:tr>
+        <w:tc>
+          <w:tcPr>
+            <w:tcW w:type="dxa" w:w="1663"/>
+          </w:tcPr>
+          <w:p>
+            <w:r>
+              <w:rPr>
+                <w:rFonts w:ascii="Times New Roman" w:hAnsi="Times New Roman"/>
+                <w:sz w:val="20"/>
+              </w:rPr>
+              <w:t>Client_Order</w:t>
+            </w:r>
+          </w:p>
+        </w:tc>
+        <w:tc>
+          <w:tcPr>
+            <w:tcW w:type="dxa" w:w="1663"/>
+          </w:tcPr>
+          <w:p>
+            <w:r>
+              <w:rPr>
+                <w:rFonts w:ascii="Times New Roman" w:hAnsi="Times New Roman"/>
+                <w:sz w:val="20"/>
+              </w:rPr>
+              <w:t>Статус</w:t>
+            </w:r>
+          </w:p>
+        </w:tc>
+        <w:tc>
+          <w:tcPr>
+            <w:tcW w:type="dxa" w:w="1663"/>
+          </w:tcPr>
+          <w:p>
+            <w:r>
+              <w:rPr>
+                <w:rFonts w:ascii="Times New Roman" w:hAnsi="Times New Roman"/>
+                <w:sz w:val="20"/>
+              </w:rPr>
+              <w:t>status</w:t>
+            </w:r>
+          </w:p>
+        </w:tc>
+        <w:tc>
+          <w:tcPr>
+            <w:tcW w:type="dxa" w:w="1663"/>
+          </w:tcPr>
+          <w:p>
+            <w:r>
+              <w:rPr>
+                <w:rFonts w:ascii="Times New Roman" w:hAnsi="Times New Roman"/>
+                <w:sz w:val="20"/>
+              </w:rPr>
+              <w:t>S</w:t>
+            </w:r>
+          </w:p>
+        </w:tc>
+        <w:tc>
+          <w:tcPr>
+            <w:tcW w:type="dxa" w:w="1663"/>
+          </w:tcPr>
+          <w:p>
+            <w:r>
+              <w:rPr>
+                <w:rFonts w:ascii="Times New Roman" w:hAnsi="Times New Roman"/>
+                <w:sz w:val="20"/>
+              </w:rPr>
+              <w:t>50</w:t>
+            </w:r>
+          </w:p>
+        </w:tc>
+        <w:tc>
+          <w:tcPr>
+            <w:tcW w:type="dxa" w:w="1663"/>
+          </w:tcPr>
+          <w:p>
+            <w:r>
+              <w:rPr>
+                <w:rFonts w:ascii="Times New Roman" w:hAnsi="Times New Roman"/>
+                <w:sz w:val="20"/>
+              </w:rPr>
+            </w:r>
+          </w:p>
+        </w:tc>
+      </w:tr>
     </w:tbl>
     <w:p>
       <w:pPr>
@@ -2189,6 +4260,36 @@
                 <w:rFonts w:ascii="Times New Roman" w:hAnsi="Times New Roman"/>
                 <w:sz w:val="22"/>
               </w:rPr>
+              <w:t>part_category</w:t>
+            </w:r>
+          </w:p>
+        </w:tc>
+        <w:tc>
+          <w:tcPr>
+            <w:tcW w:type="dxa" w:w="4989"/>
+          </w:tcPr>
+          <w:p>
+            <w:r>
+              <w:rPr>
+                <w:rFonts w:ascii="Times New Roman" w:hAnsi="Times New Roman"/>
+                <w:sz w:val="22"/>
+              </w:rPr>
+              <w:t>Справочник категорий комплектующих деталей (например, Процессоры, Корпуса)</w:t>
+            </w:r>
+          </w:p>
+        </w:tc>
+      </w:tr>
+      <w:tr>
+        <w:tc>
+          <w:tcPr>
+            <w:tcW w:type="dxa" w:w="4989"/>
+          </w:tcPr>
+          <w:p>
+            <w:r>
+              <w:rPr>
+                <w:rFonts w:ascii="Times New Roman" w:hAnsi="Times New Roman"/>
+                <w:sz w:val="22"/>
+              </w:rPr>
               <w:t>part</w:t>
             </w:r>
           </w:p>
@@ -2203,7 +4304,67 @@
                 <w:rFonts w:ascii="Times New Roman" w:hAnsi="Times New Roman"/>
                 <w:sz w:val="22"/>
               </w:rPr>
-              <w:t>Справочник комплектующих деталей с артикулами</w:t>
+              <w:t>Справочник деталей с артикулами и привязкой к категориям</w:t>
+            </w:r>
+          </w:p>
+        </w:tc>
+      </w:tr>
+      <w:tr>
+        <w:tc>
+          <w:tcPr>
+            <w:tcW w:type="dxa" w:w="4989"/>
+          </w:tcPr>
+          <w:p>
+            <w:r>
+              <w:rPr>
+                <w:rFonts w:ascii="Times New Roman" w:hAnsi="Times New Roman"/>
+                <w:sz w:val="22"/>
+              </w:rPr>
+              <w:t>supplier</w:t>
+            </w:r>
+          </w:p>
+        </w:tc>
+        <w:tc>
+          <w:tcPr>
+            <w:tcW w:type="dxa" w:w="4989"/>
+          </w:tcPr>
+          <w:p>
+            <w:r>
+              <w:rPr>
+                <w:rFonts w:ascii="Times New Roman" w:hAnsi="Times New Roman"/>
+                <w:sz w:val="22"/>
+              </w:rPr>
+              <w:t>Справочник поставщиков деталей</w:t>
+            </w:r>
+          </w:p>
+        </w:tc>
+      </w:tr>
+      <w:tr>
+        <w:tc>
+          <w:tcPr>
+            <w:tcW w:type="dxa" w:w="4989"/>
+          </w:tcPr>
+          <w:p>
+            <w:r>
+              <w:rPr>
+                <w:rFonts w:ascii="Times New Roman" w:hAnsi="Times New Roman"/>
+                <w:sz w:val="22"/>
+              </w:rPr>
+              <w:t>part_supply</w:t>
+            </w:r>
+          </w:p>
+        </w:tc>
+        <w:tc>
+          <w:tcPr>
+            <w:tcW w:type="dxa" w:w="4989"/>
+          </w:tcPr>
+          <w:p>
+            <w:r>
+              <w:rPr>
+                <w:rFonts w:ascii="Times New Roman" w:hAnsi="Times New Roman"/>
+                <w:sz w:val="22"/>
+              </w:rPr>
+              <w:t>Регистрационный журнал поставок деталей (цена, количество, дата)</w:t>
             </w:r>
           </w:p>
         </w:tc>
@@ -2263,7 +4424,7 @@
                 <w:rFonts w:ascii="Times New Roman" w:hAnsi="Times New Roman"/>
                 <w:sz w:val="22"/>
               </w:rPr>
-              <w:t>Спецификации состава готовой продукции (расход деталей)</w:t>
+              <w:t>Спецификации состава готовой продукции (расход деталей на единицу изделия)</w:t>
             </w:r>
           </w:p>
         </w:tc>
@@ -2323,7 +4484,7 @@
                 <w:rFonts w:ascii="Times New Roman" w:hAnsi="Times New Roman"/>
                 <w:sz w:val="22"/>
               </w:rPr>
-              <w:t>Ячейки адресного хранения готовых изделий на складе продукции</w:t>
+              <w:t>Ячейки адресного хранения готовых изделий на складе готовой продукции</w:t>
             </w:r>
           </w:p>
         </w:tc>
@@ -2354,6 +4515,36 @@
                 <w:sz w:val="22"/>
               </w:rPr>
               <w:t>Целевые показатели плана выпуска готовой продукции</w:t>
+            </w:r>
+          </w:p>
+        </w:tc>
+      </w:tr>
+      <w:tr>
+        <w:tc>
+          <w:tcPr>
+            <w:tcW w:type="dxa" w:w="4989"/>
+          </w:tcPr>
+          <w:p>
+            <w:r>
+              <w:rPr>
+                <w:rFonts w:ascii="Times New Roman" w:hAnsi="Times New Roman"/>
+                <w:sz w:val="22"/>
+              </w:rPr>
+              <w:t>client_order</w:t>
+            </w:r>
+          </w:p>
+        </w:tc>
+        <w:tc>
+          <w:tcPr>
+            <w:tcW w:type="dxa" w:w="4989"/>
+          </w:tcPr>
+          <w:p>
+            <w:r>
+              <w:rPr>
+                <w:rFonts w:ascii="Times New Roman" w:hAnsi="Times New Roman"/>
+                <w:sz w:val="22"/>
+              </w:rPr>
+              <w:t>Журнал заказов клиентов на сборку готовой продукции с отслеживанием статусов</w:t>
             </w:r>
           </w:p>
         </w:tc>
@@ -2412,7 +4603,7 @@
     </w:p>
     <w:p>
       <w:r>
-        <w:t>Разработка базы данных выполнена в реляционной СУБД SQLite. База данных содержит 6 таблиц. Связи контролируются внешними ключами с каскадным удалением.</w:t>
+        <w:t>Разработка базы данных выполнена в реляционной СУБД SQLite. База данных содержит 10 таблиц. Связи контролируются внешними ключами с каскадным удалением.</w:t>
       </w:r>
     </w:p>
     <w:p>
@@ -2445,13 +4636,58 @@
           <w:rFonts w:ascii="Courier New" w:hAnsi="Courier New"/>
           <w:sz w:val="20"/>
         </w:rPr>
+        <w:t>CREATE TABLE part_category (</w:t>
+        <w:br/>
+        <w:t xml:space="preserve">    id_category INTEGER PRIMARY KEY AUTOINCREMENT,</w:t>
+        <w:br/>
+        <w:t xml:space="preserve">    name TEXT NOT NULL UNIQUE</w:t>
+        <w:br/>
+        <w:t>);</w:t>
+        <w:br/>
+        <w:br/>
         <w:t>CREATE TABLE part (</w:t>
         <w:br/>
         <w:t xml:space="preserve">    id_part INTEGER PRIMARY KEY AUTOINCREMENT,</w:t>
         <w:br/>
         <w:t xml:space="preserve">    name TEXT NOT NULL,</w:t>
         <w:br/>
-        <w:t xml:space="preserve">    article TEXT NOT NULL</w:t>
+        <w:t xml:space="preserve">    article TEXT NOT NULL UNIQUE,</w:t>
+        <w:br/>
+        <w:t xml:space="preserve">    category_id INTEGER,</w:t>
+        <w:br/>
+        <w:t xml:space="preserve">    FOREIGN KEY (category_id) REFERENCES part_category (id_category) ON DELETE SET NULL</w:t>
+        <w:br/>
+        <w:t>);</w:t>
+        <w:br/>
+        <w:br/>
+        <w:t>CREATE TABLE supplier (</w:t>
+        <w:br/>
+        <w:t xml:space="preserve">    id_supplier INTEGER PRIMARY KEY AUTOINCREMENT,</w:t>
+        <w:br/>
+        <w:t xml:space="preserve">    name TEXT NOT NULL UNIQUE,</w:t>
+        <w:br/>
+        <w:t xml:space="preserve">    contact_info TEXT</w:t>
+        <w:br/>
+        <w:t>);</w:t>
+        <w:br/>
+        <w:br/>
+        <w:t>CREATE TABLE part_supply (</w:t>
+        <w:br/>
+        <w:t xml:space="preserve">    id_supply INTEGER PRIMARY KEY AUTOINCREMENT,</w:t>
+        <w:br/>
+        <w:t xml:space="preserve">    supplier_id INTEGER,</w:t>
+        <w:br/>
+        <w:t xml:space="preserve">    part_id INTEGER,</w:t>
+        <w:br/>
+        <w:t xml:space="preserve">    quantity INTEGER NOT NULL,</w:t>
+        <w:br/>
+        <w:t xml:space="preserve">    price REAL NOT NULL,</w:t>
+        <w:br/>
+        <w:t xml:space="preserve">    supply_date TEXT NOT NULL,</w:t>
+        <w:br/>
+        <w:t xml:space="preserve">    FOREIGN KEY (supplier_id) REFERENCES supplier (id_supplier) ON DELETE CASCADE,</w:t>
+        <w:br/>
+        <w:t xml:space="preserve">    FOREIGN KEY (part_id) REFERENCES part (id_part) ON DELETE CASCADE</w:t>
         <w:br/>
         <w:t>);</w:t>
         <w:br/>
@@ -2460,7 +4696,7 @@
         <w:br/>
         <w:t xml:space="preserve">    id_product_type INTEGER PRIMARY KEY AUTOINCREMENT,</w:t>
         <w:br/>
-        <w:t xml:space="preserve">    name TEXT NOT NULL,</w:t>
+        <w:t xml:space="preserve">    name TEXT NOT NULL UNIQUE,</w:t>
         <w:br/>
         <w:t xml:space="preserve">    description TEXT</w:t>
         <w:br/>
@@ -2473,7 +4709,7 @@
         <w:br/>
         <w:t xml:space="preserve">    part_id INTEGER,</w:t>
         <w:br/>
-        <w:t xml:space="preserve">    quantity INTEGER,</w:t>
+        <w:t xml:space="preserve">    quantity INTEGER NOT NULL,</w:t>
         <w:br/>
         <w:t xml:space="preserve">    PRIMARY KEY (product_type_id, part_id),</w:t>
         <w:br/>
@@ -2494,7 +4730,56 @@
         <w:br/>
         <w:t xml:space="preserve">    quantity_stored INTEGER DEFAULT 0,</w:t>
         <w:br/>
-        <w:t xml:space="preserve">    FOREIGN KEY (part_id) REFERENCES part (id_part) ON DELETE CASCADE</w:t>
+        <w:t xml:space="preserve">    FOREIGN KEY (part_id) REFERENCES part (id_part) ON DELETE CASCADE,</w:t>
+        <w:br/>
+        <w:t xml:space="preserve">    UNIQUE(cell_number, part_id)</w:t>
+        <w:br/>
+        <w:t>);</w:t>
+        <w:br/>
+        <w:br/>
+        <w:t>CREATE TABLE product_warehouse_cell (</w:t>
+        <w:br/>
+        <w:t xml:space="preserve">    id_product_cell INTEGER PRIMARY KEY AUTOINCREMENT,</w:t>
+        <w:br/>
+        <w:t xml:space="preserve">    cell_number TEXT NOT NULL,</w:t>
+        <w:br/>
+        <w:t xml:space="preserve">    product_type_id INTEGER,</w:t>
+        <w:br/>
+        <w:t xml:space="preserve">    quantity_stored INTEGER DEFAULT 0,</w:t>
+        <w:br/>
+        <w:t xml:space="preserve">    FOREIGN KEY (product_type_id) REFERENCES product_type (id_product_type) ON DELETE CASCADE,</w:t>
+        <w:br/>
+        <w:t xml:space="preserve">    UNIQUE(cell_number, product_type_id)</w:t>
+        <w:br/>
+        <w:t>);</w:t>
+        <w:br/>
+        <w:br/>
+        <w:t>CREATE TABLE production_plan (</w:t>
+        <w:br/>
+        <w:t xml:space="preserve">    product_type_id INTEGER PRIMARY KEY,</w:t>
+        <w:br/>
+        <w:t xml:space="preserve">    target_quantity INTEGER DEFAULT 0,</w:t>
+        <w:br/>
+        <w:t xml:space="preserve">    FOREIGN KEY (product_type_id) REFERENCES product_type (id_product_type) ON DELETE CASCADE</w:t>
+        <w:br/>
+        <w:t>);</w:t>
+        <w:br/>
+        <w:br/>
+        <w:t>CREATE TABLE client_order (</w:t>
+        <w:br/>
+        <w:t xml:space="preserve">    id_order INTEGER PRIMARY KEY AUTOINCREMENT,</w:t>
+        <w:br/>
+        <w:t xml:space="preserve">    customer_name TEXT NOT NULL,</w:t>
+        <w:br/>
+        <w:t xml:space="preserve">    product_type_id INTEGER,</w:t>
+        <w:br/>
+        <w:t xml:space="preserve">    quantity INTEGER NOT NULL,</w:t>
+        <w:br/>
+        <w:t xml:space="preserve">    order_date TEXT NOT NULL,</w:t>
+        <w:br/>
+        <w:t xml:space="preserve">    status TEXT DEFAULT 'В обработке',</w:t>
+        <w:br/>
+        <w:t xml:space="preserve">    FOREIGN KEY (product_type_id) REFERENCES product_type (id_product_type) ON DELETE CASCADE</w:t>
         <w:br/>
         <w:t>);</w:t>
       </w:r>

</xml_diff>